<commit_message>
Fix 3D massing overlap: gaps between zones, opaque faces, depth-sort hint, better angle
Co-Authored-By: Claude Opus 4.8 <noreply@anthropic.com>
</commit_message>
<xml_diff>
--- a/outputs/reports/Deliverable2_FutureState_DRAFT.docx
+++ b/outputs/reports/Deliverable2_FutureState_DRAFT.docx
@@ -1912,7 +1912,7 @@
       <w:r>
         <w:drawing>
           <wp:inline xmlns:a="http://schemas.openxmlformats.org/drawingml/2006/main" xmlns:pic="http://schemas.openxmlformats.org/drawingml/2006/picture">
-            <wp:extent cx="5040000" cy="4174925"/>
+            <wp:extent cx="5040000" cy="4297874"/>
             <wp:docPr id="6" name="Picture 6"/>
             <wp:cNvGraphicFramePr>
               <a:graphicFrameLocks noChangeAspect="1"/>
@@ -1933,7 +1933,7 @@
                   <pic:spPr>
                     <a:xfrm>
                       <a:off x="0" y="0"/>
-                      <a:ext cx="5040000" cy="4174925"/>
+                      <a:ext cx="5040000" cy="4297874"/>
                     </a:xfrm>
                     <a:prstGeom prst="rect"/>
                   </pic:spPr>

</xml_diff>

<commit_message>
3D massing: realistic zone heights (racking tall, floor ops low); verified vs 2D
Co-Authored-By: Claude Opus 4.8 <noreply@anthropic.com>
</commit_message>
<xml_diff>
--- a/outputs/reports/Deliverable2_FutureState_DRAFT.docx
+++ b/outputs/reports/Deliverable2_FutureState_DRAFT.docx
@@ -1912,7 +1912,7 @@
       <w:r>
         <w:drawing>
           <wp:inline xmlns:a="http://schemas.openxmlformats.org/drawingml/2006/main" xmlns:pic="http://schemas.openxmlformats.org/drawingml/2006/picture">
-            <wp:extent cx="5040000" cy="4297874"/>
+            <wp:extent cx="5040000" cy="4286896"/>
             <wp:docPr id="6" name="Picture 6"/>
             <wp:cNvGraphicFramePr>
               <a:graphicFrameLocks noChangeAspect="1"/>
@@ -1933,7 +1933,7 @@
                   <pic:spPr>
                     <a:xfrm>
                       <a:off x="0" y="0"/>
-                      <a:ext cx="5040000" cy="4297874"/>
+                      <a:ext cx="5040000" cy="4286896"/>
                     </a:xfrm>
                     <a:prstGeom prst="rect"/>
                   </pic:spPr>

</xml_diff>

<commit_message>
Layout: manual isometric 3D (fixes overlap) + 2D order-flow arrows; receiving dock-adjacent
- 3D massing redrawn as painter-ordered isometric with shaded faces (no false overlap)
- 2D adds numbered order-movement arrows (inbound/putaway, replenishment, pick->pack->ship) with legend
- reorder left column so Receiving sits next to its docks (logical inbound flow)

Co-Authored-By: Claude Opus 4.8 <noreply@anthropic.com>
</commit_message>
<xml_diff>
--- a/outputs/reports/Deliverable2_FutureState_DRAFT.docx
+++ b/outputs/reports/Deliverable2_FutureState_DRAFT.docx
@@ -1858,7 +1858,7 @@
       <w:r>
         <w:drawing>
           <wp:inline xmlns:a="http://schemas.openxmlformats.org/drawingml/2006/main" xmlns:pic="http://schemas.openxmlformats.org/drawingml/2006/picture">
-            <wp:extent cx="5760000" cy="3816673"/>
+            <wp:extent cx="5760000" cy="4333458"/>
             <wp:docPr id="5" name="Picture 5"/>
             <wp:cNvGraphicFramePr>
               <a:graphicFrameLocks noChangeAspect="1"/>
@@ -1879,7 +1879,7 @@
                   <pic:spPr>
                     <a:xfrm>
                       <a:off x="0" y="0"/>
-                      <a:ext cx="5760000" cy="3816673"/>
+                      <a:ext cx="5760000" cy="4333458"/>
                     </a:xfrm>
                     <a:prstGeom prst="rect"/>
                   </pic:spPr>
@@ -1912,7 +1912,7 @@
       <w:r>
         <w:drawing>
           <wp:inline xmlns:a="http://schemas.openxmlformats.org/drawingml/2006/main" xmlns:pic="http://schemas.openxmlformats.org/drawingml/2006/picture">
-            <wp:extent cx="5040000" cy="4286896"/>
+            <wp:extent cx="5040000" cy="4123637"/>
             <wp:docPr id="6" name="Picture 6"/>
             <wp:cNvGraphicFramePr>
               <a:graphicFrameLocks noChangeAspect="1"/>
@@ -1933,7 +1933,7 @@
                   <pic:spPr>
                     <a:xfrm>
                       <a:off x="0" y="0"/>
-                      <a:ext cx="5040000" cy="4286896"/>
+                      <a:ext cx="5040000" cy="4123637"/>
                     </a:xfrm>
                     <a:prstGeom prst="rect"/>
                   </pic:spPr>

</xml_diff>

<commit_message>
Add 2D worker-movement model (zone picking) + include in Deliverable 2
Co-Authored-By: Claude Opus 4.8 <noreply@anthropic.com>
</commit_message>
<xml_diff>
--- a/outputs/reports/Deliverable2_FutureState_DRAFT.docx
+++ b/outputs/reports/Deliverable2_FutureState_DRAFT.docx
@@ -1902,7 +1902,7 @@
           <w:color w:val="666666"/>
           <w:sz w:val="17"/>
         </w:rPr>
-        <w:t>Fig 5. Option B layout &amp; zoning, to scale, with material flow.</w:t>
+        <w:t>Fig 5. Option B layout &amp; zoning, to scale, with order flow (①inbound→⑥ship).</w:t>
       </w:r>
     </w:p>
     <w:p>
@@ -1956,7 +1956,61 @@
           <w:color w:val="666666"/>
           <w:sz w:val="17"/>
         </w:rPr>
-        <w:t>Fig 6. Option B 3D massing — reserve racking ≈ 11.5 m within the 12.2 m limit.</w:t>
+        <w:t>Fig 6. Option B 3D massing (isometric) — reserve racking ≈ 11.5 m within the 12.2 m limit.</w:t>
+      </w:r>
+    </w:p>
+    <w:p>
+      <w:pPr>
+        <w:jc w:val="center"/>
+      </w:pPr>
+      <w:r>
+        <w:drawing>
+          <wp:inline xmlns:a="http://schemas.openxmlformats.org/drawingml/2006/main" xmlns:pic="http://schemas.openxmlformats.org/drawingml/2006/picture">
+            <wp:extent cx="5760000" cy="3915852"/>
+            <wp:docPr id="7" name="Picture 7"/>
+            <wp:cNvGraphicFramePr>
+              <a:graphicFrameLocks noChangeAspect="1"/>
+            </wp:cNvGraphicFramePr>
+            <a:graphic>
+              <a:graphicData uri="http://schemas.openxmlformats.org/drawingml/2006/picture">
+                <pic:pic>
+                  <pic:nvPicPr>
+                    <pic:cNvPr id="0" name="layout_worker_flow.png"/>
+                    <pic:cNvPicPr/>
+                  </pic:nvPicPr>
+                  <pic:blipFill>
+                    <a:blip r:embed="rId15"/>
+                    <a:stretch>
+                      <a:fillRect/>
+                    </a:stretch>
+                  </pic:blipFill>
+                  <pic:spPr>
+                    <a:xfrm>
+                      <a:off x="0" y="0"/>
+                      <a:ext cx="5760000" cy="3915852"/>
+                    </a:xfrm>
+                    <a:prstGeom prst="rect"/>
+                  </pic:spPr>
+                </pic:pic>
+              </a:graphicData>
+            </a:graphic>
+          </wp:inline>
+        </w:drawing>
+      </w:r>
+    </w:p>
+    <w:p>
+      <w:pPr>
+        <w:spacing w:after="200"/>
+        <w:jc w:val="center"/>
+      </w:pPr>
+      <w:r>
+        <w:rPr>
+          <w:b w:val="0"/>
+          <w:i/>
+          <w:color w:val="666666"/>
+          <w:sz w:val="17"/>
+        </w:rPr>
+        <w:t>Fig 7. Worker movement — zone picking keeps picker paths short and separated.</w:t>
       </w:r>
     </w:p>
     <w:p>
@@ -2620,7 +2674,7 @@
         <w:drawing>
           <wp:inline xmlns:a="http://schemas.openxmlformats.org/drawingml/2006/main" xmlns:pic="http://schemas.openxmlformats.org/drawingml/2006/picture">
             <wp:extent cx="5040000" cy="2479726"/>
-            <wp:docPr id="7" name="Picture 7"/>
+            <wp:docPr id="8" name="Picture 8"/>
             <wp:cNvGraphicFramePr>
               <a:graphicFrameLocks noChangeAspect="1"/>
             </wp:cNvGraphicFramePr>
@@ -2632,7 +2686,7 @@
                     <pic:cNvPicPr/>
                   </pic:nvPicPr>
                   <pic:blipFill>
-                    <a:blip r:embed="rId15"/>
+                    <a:blip r:embed="rId16"/>
                     <a:stretch>
                       <a:fillRect/>
                     </a:stretch>
@@ -2663,7 +2717,7 @@
           <w:color w:val="666666"/>
           <w:sz w:val="17"/>
         </w:rPr>
-        <w:t>Fig 7. Labour requirement by process (average vs peak).</w:t>
+        <w:t>Fig 8. Labour requirement by process (average vs peak).</w:t>
       </w:r>
     </w:p>
     <w:p>
@@ -3420,7 +3474,7 @@
       </w:pPr>
     </w:p>
     <w:sectPr>
-      <w:footerReference w:type="default" r:id="rId16"/>
+      <w:footerReference w:type="default" r:id="rId17"/>
       <w:pgSz w:w="12240" w:h="15840"/>
       <w:pgMar w:top="1440" w:right="1800" w:bottom="1440" w:left="1800" w:header="720" w:footer="720" w:gutter="0"/>
       <w:cols w:space="720"/>

</xml_diff>

<commit_message>
Redesign worker-movement diagram: separated zones, contained routes, halos, clean labels/legend
Co-Authored-By: Claude Opus 4.8 <noreply@anthropic.com>
</commit_message>
<xml_diff>
--- a/outputs/reports/Deliverable2_FutureState_DRAFT.docx
+++ b/outputs/reports/Deliverable2_FutureState_DRAFT.docx
@@ -1966,7 +1966,7 @@
       <w:r>
         <w:drawing>
           <wp:inline xmlns:a="http://schemas.openxmlformats.org/drawingml/2006/main" xmlns:pic="http://schemas.openxmlformats.org/drawingml/2006/picture">
-            <wp:extent cx="5760000" cy="3915852"/>
+            <wp:extent cx="5760000" cy="4936332"/>
             <wp:docPr id="7" name="Picture 7"/>
             <wp:cNvGraphicFramePr>
               <a:graphicFrameLocks noChangeAspect="1"/>
@@ -1987,7 +1987,7 @@
                   <pic:spPr>
                     <a:xfrm>
                       <a:off x="0" y="0"/>
-                      <a:ext cx="5760000" cy="3915852"/>
+                      <a:ext cx="5760000" cy="4936332"/>
                     </a:xfrm>
                     <a:prstGeom prst="rect"/>
                   </pic:spPr>

</xml_diff>